<commit_message>
Add reviewed QQ email registration flow
</commit_message>
<xml_diff>
--- a/docs/design-followup-20260425.docx
+++ b/docs/design-followup-20260425.docx
@@ -8,11 +8,12 @@
       </w:pPr>
       <w:r>
         <w:rPr>
+          <w:rFonts w:ascii="Microsoft YaHei" w:hAnsi="Microsoft YaHei" w:eastAsia="Microsoft YaHei"/>
           <w:b/>
-          <w:color w:val="1F4E79"/>
+          <w:color w:val="1E3A5F"/>
           <w:sz w:val="40"/>
         </w:rPr>
-        <w:t>诸城叙梦设计需求补充说明</w:t>
+        <w:t>诸城叙梦素材平台补充说明</w:t>
       </w:r>
     </w:p>
     <w:p>
@@ -21,435 +22,632 @@
       </w:pPr>
       <w:r>
         <w:rPr>
-          <w:color w:val="595959"/>
+          <w:rFonts w:ascii="Microsoft YaHei" w:hAnsi="Microsoft YaHei" w:eastAsia="Microsoft YaHei"/>
+          <w:color w:val="5A6474"/>
           <w:sz w:val="22"/>
         </w:rPr>
-        <w:t>未完善事项 / 待确认项（2026-04-25）</w:t>
+        <w:t>注册审核流程更新 · 2026年4月25日</w:t>
       </w:r>
     </w:p>
     <w:p>
       <w:pPr>
-        <w:spacing w:after="160"/>
+        <w:pStyle w:val="Heading1"/>
       </w:pPr>
       <w:r>
         <w:rPr>
-          <w:b/>
+          <w:rFonts w:ascii="Microsoft YaHei" w:hAnsi="Microsoft YaHei" w:eastAsia="Microsoft YaHei"/>
+          <w:color w:val="1E3A5F"/>
         </w:rPr>
-        <w:t>说明：</w:t>
-      </w:r>
-      <w:r>
-        <w:t>本补充文档只记录本轮未完全落地、需要业务确认，或依赖服务器/外部服务配置的事项。已直接实装并验证通过的字段、流程和页面调整不在此重复展开。</w:t>
+        <w:t>一、已实施变更</w:t>
       </w:r>
     </w:p>
     <w:p>
       <w:pPr>
-        <w:spacing w:before="80" w:after="60"/>
+        <w:spacing w:after="120" w:line="269" w:lineRule="auto"/>
+        <w:ind w:left="142" w:hanging="142"/>
       </w:pPr>
       <w:r>
         <w:rPr>
+          <w:rFonts w:ascii="Microsoft YaHei" w:hAnsi="Microsoft YaHei" w:eastAsia="Microsoft YaHei"/>
           <w:b/>
-          <w:color w:val="1F4E79"/>
-          <w:sz w:val="24"/>
+          <w:color w:val="1E3A5F"/>
+          <w:sz w:val="20"/>
         </w:rPr>
-        <w:t>1. 未注册用户与导入授权的账号合并</w:t>
+        <w:t>注册入口｜已完成：</w:t>
+      </w:r>
+      <w:r>
+        <w:rPr>
+          <w:rFonts w:ascii="Microsoft YaHei" w:hAnsi="Microsoft YaHei" w:eastAsia="Microsoft YaHei"/>
+          <w:b w:val="0"/>
+          <w:sz w:val="20"/>
+        </w:rPr>
+        <w:t>前台注册强制使用 QQ 邮箱域名（@qq.com / @vip.qq.com / @foxmail.com），非 QQ 邮箱会被前后端同时拦截。</w:t>
       </w:r>
     </w:p>
     <w:p>
       <w:pPr>
-        <w:spacing w:after="40"/>
-        <w:ind w:left="173"/>
+        <w:spacing w:after="120" w:line="269" w:lineRule="auto"/>
+        <w:ind w:left="142" w:hanging="142"/>
       </w:pPr>
       <w:r>
         <w:rPr>
+          <w:rFonts w:ascii="Microsoft YaHei" w:hAnsi="Microsoft YaHei" w:eastAsia="Microsoft YaHei"/>
           <w:b/>
+          <w:color w:val="1E3A5F"/>
+          <w:sz w:val="20"/>
         </w:rPr>
-        <w:t>当前状态：</w:t>
+        <w:t>验证码｜已完成：</w:t>
       </w:r>
       <w:r>
-        <w:t>当前管理端授权导入可以按 QQ / 圈名 ID 创建占位用户；但用户之后用邮箱注册时，系统不会自动把新注册账号与占位用户合并。</w:t>
+        <w:rPr>
+          <w:rFonts w:ascii="Microsoft YaHei" w:hAnsi="Microsoft YaHei" w:eastAsia="Microsoft YaHei"/>
+          <w:b w:val="0"/>
+          <w:sz w:val="20"/>
+        </w:rPr>
+        <w:t>注册验证码仍使用现有邮件服务；验证码通过前不会创建用户。</w:t>
       </w:r>
     </w:p>
     <w:p>
       <w:pPr>
-        <w:spacing w:after="80"/>
-        <w:ind w:left="173"/>
+        <w:spacing w:after="120" w:line="269" w:lineRule="auto"/>
+        <w:ind w:left="142" w:hanging="142"/>
       </w:pPr>
       <w:r>
         <w:rPr>
+          <w:rFonts w:ascii="Microsoft YaHei" w:hAnsi="Microsoft YaHei" w:eastAsia="Microsoft YaHei"/>
           <w:b/>
+          <w:color w:val="1E3A5F"/>
+          <w:sz w:val="20"/>
         </w:rPr>
-        <w:t>需要确认 / 建议下一步：</w:t>
+        <w:t>自定义 ID｜已完成：</w:t>
       </w:r>
       <w:r>
-        <w:t>需要确认唯一身份规则：以 QQ 为主、圈名 ID 为主，还是邮箱 + QQ 双校验。确认后再实现注册时绑定/合并历史授权。</w:t>
+        <w:rPr>
+          <w:rFonts w:ascii="Microsoft YaHei" w:hAnsi="Microsoft YaHei" w:eastAsia="Microsoft YaHei"/>
+          <w:b w:val="0"/>
+          <w:sz w:val="20"/>
+        </w:rPr>
+        <w:t>用户填写自定义 ID，继续作为登录 ID 使用；后端保持唯一性校验。</w:t>
       </w:r>
     </w:p>
     <w:p>
       <w:pPr>
-        <w:spacing w:before="180" w:after="60"/>
+        <w:spacing w:after="120" w:line="269" w:lineRule="auto"/>
+        <w:ind w:left="142" w:hanging="142"/>
       </w:pPr>
       <w:r>
         <w:rPr>
+          <w:rFonts w:ascii="Microsoft YaHei" w:hAnsi="Microsoft YaHei" w:eastAsia="Microsoft YaHei"/>
           <w:b/>
-          <w:color w:val="1F4E79"/>
-          <w:sz w:val="24"/>
+          <w:color w:val="1E3A5F"/>
+          <w:sz w:val="20"/>
         </w:rPr>
-        <w:t>2. 用户端转让/赞助给未注册用户</w:t>
+        <w:t>平台 UID｜已完成：</w:t>
+      </w:r>
+      <w:r>
+        <w:rPr>
+          <w:rFonts w:ascii="Microsoft YaHei" w:hAnsi="Microsoft YaHei" w:eastAsia="Microsoft YaHei"/>
+          <w:b w:val="0"/>
+          <w:sz w:val="20"/>
+        </w:rPr>
+        <w:t>后端自动生成唯一 uid；新增脚本可为历史用户回填 UID。</w:t>
       </w:r>
     </w:p>
     <w:p>
       <w:pPr>
-        <w:spacing w:after="40"/>
-        <w:ind w:left="173"/>
+        <w:spacing w:after="120" w:line="269" w:lineRule="auto"/>
+        <w:ind w:left="142" w:hanging="142"/>
       </w:pPr>
       <w:r>
         <w:rPr>
+          <w:rFonts w:ascii="Microsoft YaHei" w:hAnsi="Microsoft YaHei" w:eastAsia="Microsoft YaHei"/>
           <w:b/>
+          <w:color w:val="1E3A5F"/>
+          <w:sz w:val="20"/>
         </w:rPr>
-        <w:t>当前状态：</w:t>
+        <w:t>审核流程｜已完成：</w:t>
       </w:r>
       <w:r>
-        <w:t>当前用户端转让、即时赞助仍要求对方已存在账号；管理端批量导入可以创建占位用户。</w:t>
+        <w:rPr>
+          <w:rFonts w:ascii="Microsoft YaHei" w:hAnsi="Microsoft YaHei" w:eastAsia="Microsoft YaHei"/>
+          <w:b w:val="0"/>
+          <w:sz w:val="20"/>
+        </w:rPr>
+        <w:t>验证码通过后创建待审核用户，并自动生成一条 registration 审核申请。</w:t>
       </w:r>
     </w:p>
     <w:p>
       <w:pPr>
-        <w:spacing w:after="80"/>
-        <w:ind w:left="173"/>
+        <w:spacing w:after="120" w:line="269" w:lineRule="auto"/>
+        <w:ind w:left="142" w:hanging="142"/>
       </w:pPr>
       <w:r>
         <w:rPr>
+          <w:rFonts w:ascii="Microsoft YaHei" w:hAnsi="Microsoft YaHei" w:eastAsia="Microsoft YaHei"/>
           <w:b/>
+          <w:color w:val="1E3A5F"/>
+          <w:sz w:val="20"/>
         </w:rPr>
-        <w:t>需要确认 / 建议下一步：</w:t>
+        <w:t>登录限制｜已完成：</w:t>
       </w:r>
       <w:r>
-        <w:t>需要确认是否允许普通用户输入 QQ 后自动创建占位用户。若允许，需要增加防误填确认、后续认领和管理员纠错流程。</w:t>
+        <w:rPr>
+          <w:rFonts w:ascii="Microsoft YaHei" w:hAnsi="Microsoft YaHei" w:eastAsia="Microsoft YaHei"/>
+          <w:b w:val="0"/>
+          <w:sz w:val="20"/>
+        </w:rPr>
+        <w:t>待审核和已拒绝账号无法登录；只有审核通过后才能拿到登录令牌。</w:t>
       </w:r>
     </w:p>
     <w:p>
       <w:pPr>
-        <w:spacing w:before="180" w:after="60"/>
+        <w:spacing w:after="120" w:line="269" w:lineRule="auto"/>
+        <w:ind w:left="142" w:hanging="142"/>
       </w:pPr>
       <w:r>
         <w:rPr>
+          <w:rFonts w:ascii="Microsoft YaHei" w:hAnsi="Microsoft YaHei" w:eastAsia="Microsoft YaHei"/>
           <w:b/>
-          <w:color w:val="1F4E79"/>
-          <w:sz w:val="24"/>
+          <w:color w:val="1E3A5F"/>
+          <w:sz w:val="20"/>
         </w:rPr>
-        <w:t>3. 授权名单的深度修改范围</w:t>
+        <w:t>审核邮件｜已完成：</w:t>
+      </w:r>
+      <w:r>
+        <w:rPr>
+          <w:rFonts w:ascii="Microsoft YaHei" w:hAnsi="Microsoft YaHei" w:eastAsia="Microsoft YaHei"/>
+          <w:b w:val="0"/>
+          <w:sz w:val="20"/>
+        </w:rPr>
+        <w:t>注册审核通过会发送可登录通知；拒绝时可填写自定义说明并通过邮件发给用户。</w:t>
       </w:r>
     </w:p>
     <w:p>
       <w:pPr>
-        <w:spacing w:after="40"/>
-        <w:ind w:left="173"/>
+        <w:spacing w:after="120" w:line="269" w:lineRule="auto"/>
+        <w:ind w:left="142" w:hanging="142"/>
       </w:pPr>
       <w:r>
         <w:rPr>
+          <w:rFonts w:ascii="Microsoft YaHei" w:hAnsi="Microsoft YaHei" w:eastAsia="Microsoft YaHei"/>
           <w:b/>
+          <w:color w:val="1E3A5F"/>
+          <w:sz w:val="20"/>
         </w:rPr>
-        <w:t>当前状态：</w:t>
+        <w:t>后台页面｜已完成：</w:t>
       </w:r>
       <w:r>
-        <w:t>本轮已增加按素材查看授权名单、导出 CSV、修改获取类型/积分/发货链接。暂未开放直接改归属人、赞助方/被赞助方关系。</w:t>
+        <w:rPr>
+          <w:rFonts w:ascii="Microsoft YaHei" w:hAnsi="Microsoft YaHei" w:eastAsia="Microsoft YaHei"/>
+          <w:b w:val="0"/>
+          <w:sz w:val="20"/>
+        </w:rPr>
+        <w:t>审核中心支持注册审核与回购审核；用户列表/详情展示 UID 和注册审核状态。</w:t>
+      </w:r>
+    </w:p>
+    <w:p/>
+    <w:p>
+      <w:pPr>
+        <w:pStyle w:val="Heading1"/>
+      </w:pPr>
+      <w:r>
+        <w:rPr>
+          <w:rFonts w:ascii="Microsoft YaHei" w:hAnsi="Microsoft YaHei" w:eastAsia="Microsoft YaHei"/>
+          <w:color w:val="1E3A5F"/>
+        </w:rPr>
+        <w:t>二、数据字段变更</w:t>
       </w:r>
     </w:p>
     <w:p>
       <w:pPr>
-        <w:spacing w:after="80"/>
-        <w:ind w:left="173"/>
+        <w:pStyle w:val="ListBullet"/>
+        <w:spacing w:after="80" w:line="269" w:lineRule="auto"/>
       </w:pPr>
       <w:r>
         <w:rPr>
-          <w:b/>
+          <w:rFonts w:ascii="Microsoft YaHei" w:hAnsi="Microsoft YaHei" w:eastAsia="Microsoft YaHei"/>
+          <w:b w:val="0"/>
+          <w:sz w:val="20"/>
         </w:rPr>
-        <w:t>需要确认 / 建议下一步：</w:t>
-      </w:r>
-      <w:r>
-        <w:t>这类修改会影响积分、VIP、流水和回购链路。若需要，请确认操作权限、审计记录和是否自动重算历史积分。</w:t>
+        <w:t>User 新增 uid：系统自动生成的唯一内部编号，用于后台识别。</w:t>
       </w:r>
     </w:p>
     <w:p>
       <w:pPr>
-        <w:spacing w:before="180" w:after="60"/>
+        <w:pStyle w:val="ListBullet"/>
+        <w:spacing w:after="80" w:line="269" w:lineRule="auto"/>
       </w:pPr>
       <w:r>
         <w:rPr>
-          <w:b/>
-          <w:color w:val="1F4E79"/>
-          <w:sz w:val="24"/>
+          <w:rFonts w:ascii="Microsoft YaHei" w:hAnsi="Microsoft YaHei" w:eastAsia="Microsoft YaHei"/>
+          <w:b w:val="0"/>
+          <w:sz w:val="20"/>
         </w:rPr>
-        <w:t>4. 图片上传规格与多图</w:t>
+        <w:t>User 新增 registration_status：pending、approved、rejected 三种状态；旧用户按 approved 兼容处理。</w:t>
       </w:r>
     </w:p>
     <w:p>
       <w:pPr>
-        <w:spacing w:after="40"/>
-        <w:ind w:left="173"/>
+        <w:pStyle w:val="ListBullet"/>
+        <w:spacing w:after="80" w:line="269" w:lineRule="auto"/>
       </w:pPr>
       <w:r>
         <w:rPr>
-          <w:b/>
+          <w:rFonts w:ascii="Microsoft YaHei" w:hAnsi="Microsoft YaHei" w:eastAsia="Microsoft YaHei"/>
+          <w:b w:val="0"/>
+          <w:sz w:val="20"/>
         </w:rPr>
-        <w:t>当前状态：</w:t>
-      </w:r>
-      <w:r>
-        <w:t>当前结车图/预览图支持单图上传，格式 jpg/png/webp/gif，大小上限 5MB；也可填外部图片 URL。</w:t>
+        <w:t>User 新增 registration_reviewed_by、registration_reviewed_at、registration_reject_reason，用于记录审核结果。</w:t>
       </w:r>
     </w:p>
     <w:p>
       <w:pPr>
-        <w:spacing w:after="80"/>
-        <w:ind w:left="173"/>
+        <w:pStyle w:val="ListBullet"/>
+        <w:spacing w:after="80" w:line="269" w:lineRule="auto"/>
       </w:pPr>
       <w:r>
         <w:rPr>
-          <w:b/>
+          <w:rFonts w:ascii="Microsoft YaHei" w:hAnsi="Microsoft YaHei" w:eastAsia="Microsoft YaHei"/>
+          <w:b w:val="0"/>
+          <w:sz w:val="20"/>
         </w:rPr>
-        <w:t>需要确认 / 建议下一步：</w:t>
-      </w:r>
-      <w:r>
-        <w:t>需要确认是否要支持多图、固定裁剪比例、压缩、水印或 CDN。</w:t>
+        <w:t>Application.type 新增 registration，注册审核与回购审核共用审核中心。</w:t>
       </w:r>
     </w:p>
     <w:p>
       <w:pPr>
-        <w:spacing w:before="180" w:after="60"/>
+        <w:pStyle w:val="ListBullet"/>
+        <w:spacing w:after="80" w:line="269" w:lineRule="auto"/>
       </w:pPr>
       <w:r>
         <w:rPr>
-          <w:b/>
-          <w:color w:val="1F4E79"/>
-          <w:sz w:val="24"/>
+          <w:rFonts w:ascii="Microsoft YaHei" w:hAnsi="Microsoft YaHei" w:eastAsia="Microsoft YaHei"/>
+          <w:b w:val="0"/>
+          <w:sz w:val="20"/>
         </w:rPr>
-        <w:t>5. 网站“不安全”提示</w:t>
+        <w:t>新增 npm 脚本 backfill:user-uids，可为历史用户补齐 uid。</w:t>
       </w:r>
     </w:p>
     <w:p>
       <w:pPr>
-        <w:spacing w:after="40"/>
-        <w:ind w:left="173"/>
+        <w:pStyle w:val="Heading1"/>
       </w:pPr>
       <w:r>
         <w:rPr>
-          <w:b/>
+          <w:rFonts w:ascii="Microsoft YaHei" w:hAnsi="Microsoft YaHei" w:eastAsia="Microsoft YaHei"/>
+          <w:color w:val="1E3A5F"/>
         </w:rPr>
-        <w:t>当前状态：</w:t>
-      </w:r>
-      <w:r>
-        <w:t>当前生产入口仍是 HTTP/IP 访问，浏览器会显示不安全。代码层面无法单独消除该提示。</w:t>
+        <w:t>三、生产同步步骤</w:t>
       </w:r>
     </w:p>
     <w:p>
       <w:pPr>
-        <w:spacing w:after="80"/>
-        <w:ind w:left="173"/>
+        <w:spacing w:after="120" w:line="276" w:lineRule="auto"/>
       </w:pPr>
       <w:r>
         <w:rPr>
-          <w:b/>
+          <w:rFonts w:ascii="Microsoft YaHei" w:hAnsi="Microsoft YaHei" w:eastAsia="Microsoft YaHei"/>
+          <w:b w:val="0"/>
+          <w:sz w:val="21"/>
         </w:rPr>
-        <w:t>需要确认 / 建议下一步：</w:t>
-      </w:r>
-      <w:r>
-        <w:t>需要域名、DNS 解析和 SSL 证书，然后配置 Nginx HTTPS 与 HTTP 跳转。</w:t>
-      </w:r>
-    </w:p>
-    <w:p>
-      <w:r>
-        <w:br w:type="page"/>
+        <w:t>本次部署不需要新增邮件环境变量，继续使用现有 MAIL_HOST / MAIL_USER / MAIL_PASS / MAIL_FROM。</w:t>
       </w:r>
     </w:p>
     <w:p>
       <w:pPr>
-        <w:spacing w:before="180" w:after="60"/>
+        <w:pStyle w:val="ListBullet"/>
+        <w:spacing w:after="80" w:line="269" w:lineRule="auto"/>
       </w:pPr>
       <w:r>
         <w:rPr>
-          <w:b/>
-          <w:color w:val="1F4E79"/>
-          <w:sz w:val="24"/>
+          <w:rFonts w:ascii="Microsoft YaHei" w:hAnsi="Microsoft YaHei" w:eastAsia="Microsoft YaHei"/>
+          <w:b w:val="0"/>
+          <w:sz w:val="20"/>
         </w:rPr>
-        <w:t>6. 导入去重策略</w:t>
+        <w:t>拉取 master 最新代码。</w:t>
       </w:r>
     </w:p>
     <w:p>
       <w:pPr>
-        <w:spacing w:after="40"/>
-        <w:ind w:left="173"/>
+        <w:pStyle w:val="ListBullet"/>
+        <w:spacing w:after="80" w:line="269" w:lineRule="auto"/>
       </w:pPr>
       <w:r>
         <w:rPr>
-          <w:b/>
+          <w:rFonts w:ascii="Microsoft YaHei" w:hAnsi="Microsoft YaHei" w:eastAsia="Microsoft YaHei"/>
+          <w:b w:val="0"/>
+          <w:sz w:val="20"/>
         </w:rPr>
-        <w:t>当前状态：</w:t>
-      </w:r>
-      <w:r>
-        <w:t>当前交易/授权导入不会自动判断重复记录，重复导入可能生成重复流水或授权。</w:t>
+        <w:t>后端执行 npm install（如依赖未变化可跳过）并运行 npm run backfill:user-uids。</w:t>
       </w:r>
     </w:p>
     <w:p>
       <w:pPr>
-        <w:spacing w:after="80"/>
-        <w:ind w:left="173"/>
+        <w:pStyle w:val="ListBullet"/>
+        <w:spacing w:after="80" w:line="269" w:lineRule="auto"/>
       </w:pPr>
       <w:r>
         <w:rPr>
-          <w:b/>
+          <w:rFonts w:ascii="Microsoft YaHei" w:hAnsi="Microsoft YaHei" w:eastAsia="Microsoft YaHei"/>
+          <w:b w:val="0"/>
+          <w:sz w:val="20"/>
         </w:rPr>
-        <w:t>需要确认 / 建议下一步：</w:t>
-      </w:r>
-      <w:r>
-        <w:t>需要确认唯一键规则，例如 SKU + QQ + 获取类型 + 日期，或由导入模板提供外部订单号。</w:t>
+        <w:t>分别构建用户前台和管理后台。</w:t>
       </w:r>
     </w:p>
     <w:p>
       <w:pPr>
-        <w:spacing w:before="180" w:after="60"/>
+        <w:pStyle w:val="ListBullet"/>
+        <w:spacing w:after="80" w:line="269" w:lineRule="auto"/>
       </w:pPr>
       <w:r>
         <w:rPr>
-          <w:b/>
-          <w:color w:val="1F4E79"/>
-          <w:sz w:val="24"/>
+          <w:rFonts w:ascii="Microsoft YaHei" w:hAnsi="Microsoft YaHei" w:eastAsia="Microsoft YaHei"/>
+          <w:b w:val="0"/>
+          <w:sz w:val="20"/>
         </w:rPr>
-        <w:t>7. 网盘链接可用性保障</w:t>
+        <w:t>重启 PM2 后端服务，并确认 /api/health 返回 ok。</w:t>
       </w:r>
     </w:p>
     <w:p>
       <w:pPr>
-        <w:spacing w:after="40"/>
-        <w:ind w:left="173"/>
+        <w:pStyle w:val="ListBullet"/>
+        <w:spacing w:after="80" w:line="269" w:lineRule="auto"/>
       </w:pPr>
       <w:r>
         <w:rPr>
-          <w:b/>
+          <w:rFonts w:ascii="Microsoft YaHei" w:hAnsi="Microsoft YaHei" w:eastAsia="Microsoft YaHei"/>
+          <w:b w:val="0"/>
+          <w:sz w:val="20"/>
         </w:rPr>
-        <w:t>当前状态：</w:t>
-      </w:r>
-      <w:r>
-        <w:t>系统按需求只保存并弹出网盘链接，不占服务器存储；当前不会定期检查链接是否失效、权限是否关闭。</w:t>
+        <w:t>冒烟测试：注册 QQ 邮箱验证码、后台审核通过、收到通过邮件、用户成功登录。</w:t>
       </w:r>
     </w:p>
     <w:p>
       <w:pPr>
-        <w:spacing w:after="80"/>
-        <w:ind w:left="173"/>
+        <w:pStyle w:val="Heading1"/>
       </w:pPr>
       <w:r>
         <w:rPr>
-          <w:b/>
+          <w:rFonts w:ascii="Microsoft YaHei" w:hAnsi="Microsoft YaHei" w:eastAsia="Microsoft YaHei"/>
+          <w:color w:val="1E3A5F"/>
         </w:rPr>
-        <w:t>需要确认 / 建议下一步：</w:t>
-      </w:r>
-      <w:r>
-        <w:t>若需要保障链接长期可用，可增加后台链接检测任务和异常列表。</w:t>
+        <w:t>四、仍需确认或后续完善</w:t>
       </w:r>
     </w:p>
     <w:p>
       <w:pPr>
-        <w:spacing w:before="180" w:after="60"/>
+        <w:spacing w:after="120" w:line="269" w:lineRule="auto"/>
+        <w:ind w:left="142" w:hanging="142"/>
       </w:pPr>
       <w:r>
         <w:rPr>
+          <w:rFonts w:ascii="Microsoft YaHei" w:hAnsi="Microsoft YaHei" w:eastAsia="Microsoft YaHei"/>
           <w:b/>
-          <w:color w:val="1F4E79"/>
-          <w:sz w:val="24"/>
+          <w:color w:val="1E3A5F"/>
+          <w:sz w:val="20"/>
         </w:rPr>
-        <w:t>8. 店铺状态“下架”的用户可见性</w:t>
+        <w:t>QQ 邮箱范围｜需确认：</w:t>
+      </w:r>
+      <w:r>
+        <w:rPr>
+          <w:rFonts w:ascii="Microsoft YaHei" w:hAnsi="Microsoft YaHei" w:eastAsia="Microsoft YaHei"/>
+          <w:b w:val="0"/>
+          <w:sz w:val="20"/>
+        </w:rPr>
+        <w:t>当前允许 @qq.com、@vip.qq.com、@foxmail.com；如必须只允许 @qq.com，需要收窄域名白名单。</w:t>
       </w:r>
     </w:p>
     <w:p>
       <w:pPr>
-        <w:spacing w:after="40"/>
-        <w:ind w:left="173"/>
+        <w:spacing w:after="120" w:line="269" w:lineRule="auto"/>
+        <w:ind w:left="142" w:hanging="142"/>
       </w:pPr>
       <w:r>
         <w:rPr>
+          <w:rFonts w:ascii="Microsoft YaHei" w:hAnsi="Microsoft YaHei" w:eastAsia="Microsoft YaHei"/>
           <w:b/>
+          <w:color w:val="1E3A5F"/>
+          <w:sz w:val="20"/>
         </w:rPr>
-        <w:t>当前状态：</w:t>
+        <w:t>拒绝后再申请｜已基础支持：</w:t>
       </w:r>
       <w:r>
-        <w:t>用户端店铺素材目前显示“在售”和“结车”，下架素材不展示；管理端可设置下架。</w:t>
+        <w:rPr>
+          <w:rFonts w:ascii="Microsoft YaHei" w:hAnsi="Microsoft YaHei" w:eastAsia="Microsoft YaHei"/>
+          <w:b w:val="0"/>
+          <w:sz w:val="20"/>
+        </w:rPr>
+        <w:t>同一邮箱被拒绝后可以重新验证码注册并再次进入审核；是否需要前台单独的“重新提交”页面可后续确认。</w:t>
       </w:r>
     </w:p>
     <w:p>
       <w:pPr>
-        <w:spacing w:after="80"/>
-        <w:ind w:left="173"/>
+        <w:spacing w:after="120" w:line="269" w:lineRule="auto"/>
+        <w:ind w:left="142" w:hanging="142"/>
       </w:pPr>
       <w:r>
         <w:rPr>
+          <w:rFonts w:ascii="Microsoft YaHei" w:hAnsi="Microsoft YaHei" w:eastAsia="Microsoft YaHei"/>
           <w:b/>
+          <w:color w:val="1E3A5F"/>
+          <w:sz w:val="20"/>
         </w:rPr>
-        <w:t>需要确认 / 建议下一步：</w:t>
+        <w:t>审核通知模板｜可优化：</w:t>
       </w:r>
       <w:r>
-        <w:t>如果“下架筛选”是指顾客也能查看下架素材，请确认展示文案和购买/下载限制。</w:t>
+        <w:rPr>
+          <w:rFonts w:ascii="Microsoft YaHei" w:hAnsi="Microsoft YaHei" w:eastAsia="Microsoft YaHei"/>
+          <w:b w:val="0"/>
+          <w:sz w:val="20"/>
+        </w:rPr>
+        <w:t>当前邮件为基础 HTML 文案；如要品牌化模板、客服联系方式或固定说明，需要补充设计文案。</w:t>
       </w:r>
     </w:p>
     <w:p>
       <w:pPr>
-        <w:spacing w:before="180" w:after="60"/>
+        <w:spacing w:after="120" w:line="269" w:lineRule="auto"/>
+        <w:ind w:left="142" w:hanging="142"/>
       </w:pPr>
       <w:r>
         <w:rPr>
+          <w:rFonts w:ascii="Microsoft YaHei" w:hAnsi="Microsoft YaHei" w:eastAsia="Microsoft YaHei"/>
           <w:b/>
-          <w:color w:val="1F4E79"/>
-          <w:sz w:val="24"/>
+          <w:color w:val="1E3A5F"/>
+          <w:sz w:val="20"/>
         </w:rPr>
-        <w:t>9. 全站级授权总表导出</w:t>
+        <w:t>历史用户 UID｜部署时执行：</w:t>
+      </w:r>
+      <w:r>
+        <w:rPr>
+          <w:rFonts w:ascii="Microsoft YaHei" w:hAnsi="Microsoft YaHei" w:eastAsia="Microsoft YaHei"/>
+          <w:b w:val="0"/>
+          <w:sz w:val="20"/>
+        </w:rPr>
+        <w:t>代码已提供回填脚本；生产同步时需要执行一次，执行后后台用户列表会显示历史用户 UID。</w:t>
       </w:r>
     </w:p>
     <w:p>
       <w:pPr>
-        <w:spacing w:after="40"/>
-        <w:ind w:left="173"/>
+        <w:spacing w:after="120" w:line="269" w:lineRule="auto"/>
+        <w:ind w:left="142" w:hanging="142"/>
       </w:pPr>
       <w:r>
         <w:rPr>
+          <w:rFonts w:ascii="Microsoft YaHei" w:hAnsi="Microsoft YaHei" w:eastAsia="Microsoft YaHei"/>
           <w:b/>
+          <w:color w:val="1E3A5F"/>
+          <w:sz w:val="20"/>
         </w:rPr>
-        <w:t>当前状态：</w:t>
+        <w:t>账号停用｜未实施：</w:t>
       </w:r>
       <w:r>
-        <w:t>本轮实现的是按单个素材导出授权名单。</w:t>
+        <w:rPr>
+          <w:rFonts w:ascii="Microsoft YaHei" w:hAnsi="Microsoft YaHei" w:eastAsia="Microsoft YaHei"/>
+          <w:b w:val="0"/>
+          <w:sz w:val="20"/>
+        </w:rPr>
+        <w:t>本次只区分注册待审、通过、拒绝；没有新增管理员停用/封禁账号流程。</w:t>
       </w:r>
     </w:p>
     <w:p>
       <w:pPr>
-        <w:spacing w:after="80"/>
-        <w:ind w:left="173"/>
+        <w:spacing w:after="120" w:line="269" w:lineRule="auto"/>
+        <w:ind w:left="142" w:hanging="142"/>
       </w:pPr>
       <w:r>
         <w:rPr>
+          <w:rFonts w:ascii="Microsoft YaHei" w:hAnsi="Microsoft YaHei" w:eastAsia="Microsoft YaHei"/>
           <w:b/>
+          <w:color w:val="1E3A5F"/>
+          <w:sz w:val="20"/>
         </w:rPr>
-        <w:t>需要确认 / 建议下一步：</w:t>
+        <w:t>审核统计｜未实施：</w:t>
       </w:r>
       <w:r>
-        <w:t>如果需要导出所有素材的完整授权总表，需要确认字段顺序、筛选条件和导出权限。</w:t>
+        <w:rPr>
+          <w:rFonts w:ascii="Microsoft YaHei" w:hAnsi="Microsoft YaHei" w:eastAsia="Microsoft YaHei"/>
+          <w:b w:val="0"/>
+          <w:sz w:val="20"/>
+        </w:rPr>
+        <w:t>仪表盘仍未显示真实待审核数量；如需要运营统计，需要新增统计接口。</w:t>
       </w:r>
     </w:p>
     <w:p>
       <w:pPr>
-        <w:spacing w:before="200"/>
+        <w:spacing w:after="120" w:line="269" w:lineRule="auto"/>
+        <w:ind w:left="142" w:hanging="142"/>
       </w:pPr>
       <w:r>
         <w:rPr>
+          <w:rFonts w:ascii="Microsoft YaHei" w:hAnsi="Microsoft YaHei" w:eastAsia="Microsoft YaHei"/>
           <w:b/>
+          <w:color w:val="1E3A5F"/>
+          <w:sz w:val="20"/>
         </w:rPr>
-        <w:t>补充建议：</w:t>
+        <w:t>HTTPS 提示｜未实施：</w:t>
       </w:r>
       <w:r>
-        <w:t>优先确认“未注册用户合并规则”和“深度修改授权名单范围”，这两项会影响数据模型和历史数据一致性。</w:t>
+        <w:rPr>
+          <w:rFonts w:ascii="Microsoft YaHei" w:hAnsi="Microsoft YaHei" w:eastAsia="Microsoft YaHei"/>
+          <w:b w:val="0"/>
+          <w:sz w:val="20"/>
+        </w:rPr>
+        <w:t>浏览器不安全提示仍需结合域名、证书和 Nginx 配置处理。</w:t>
+      </w:r>
+    </w:p>
+    <w:p/>
+    <w:p>
+      <w:pPr>
+        <w:pStyle w:val="Heading1"/>
+      </w:pPr>
+      <w:r>
+        <w:rPr>
+          <w:rFonts w:ascii="Microsoft YaHei" w:hAnsi="Microsoft YaHei" w:eastAsia="Microsoft YaHei"/>
+          <w:color w:val="1E3A5F"/>
+        </w:rPr>
+        <w:t>五、本次验证</w:t>
+      </w:r>
+    </w:p>
+    <w:p>
+      <w:pPr>
+        <w:pStyle w:val="ListBullet"/>
+        <w:spacing w:after="80" w:line="269" w:lineRule="auto"/>
+      </w:pPr>
+      <w:r>
+        <w:rPr>
+          <w:rFonts w:ascii="Microsoft YaHei" w:hAnsi="Microsoft YaHei" w:eastAsia="Microsoft YaHei"/>
+          <w:b w:val="0"/>
+          <w:sz w:val="20"/>
+        </w:rPr>
+        <w:t>后端核心流程验证：npm run verify:core 通过。</w:t>
+      </w:r>
+    </w:p>
+    <w:p>
+      <w:pPr>
+        <w:pStyle w:val="ListBullet"/>
+        <w:spacing w:after="80" w:line="269" w:lineRule="auto"/>
+      </w:pPr>
+      <w:r>
+        <w:rPr>
+          <w:rFonts w:ascii="Microsoft YaHei" w:hAnsi="Microsoft YaHei" w:eastAsia="Microsoft YaHei"/>
+          <w:b w:val="0"/>
+          <w:sz w:val="20"/>
+        </w:rPr>
+        <w:t>用户前台构建：npm run build 通过。</w:t>
+      </w:r>
+    </w:p>
+    <w:p>
+      <w:pPr>
+        <w:pStyle w:val="ListBullet"/>
+        <w:spacing w:after="80" w:line="269" w:lineRule="auto"/>
+      </w:pPr>
+      <w:r>
+        <w:rPr>
+          <w:rFonts w:ascii="Microsoft YaHei" w:hAnsi="Microsoft YaHei" w:eastAsia="Microsoft YaHei"/>
+          <w:b w:val="0"/>
+          <w:sz w:val="20"/>
+        </w:rPr>
+        <w:t>管理后台构建：npm run build 通过。</w:t>
+      </w:r>
+    </w:p>
+    <w:p>
+      <w:pPr>
+        <w:pStyle w:val="ListBullet"/>
+        <w:spacing w:after="80" w:line="269" w:lineRule="auto"/>
+      </w:pPr>
+      <w:r>
+        <w:rPr>
+          <w:rFonts w:ascii="Microsoft YaHei" w:hAnsi="Microsoft YaHei" w:eastAsia="Microsoft YaHei"/>
+          <w:b w:val="0"/>
+          <w:sz w:val="20"/>
+        </w:rPr>
+        <w:t>后端 JavaScript 语法检查通过。</w:t>
       </w:r>
     </w:p>
     <w:sectPr>
       <w:pgSz w:w="12240" w:h="15840"/>
-      <w:pgMar w:top="1037" w:right="1123" w:bottom="1037" w:left="1123" w:header="720" w:footer="720" w:gutter="0"/>
+      <w:pgMar w:top="1020" w:right="1134" w:bottom="1020" w:left="1134" w:header="720" w:footer="720" w:gutter="0"/>
       <w:cols w:space="720"/>
       <w:docGrid w:linePitch="360"/>
     </w:sectPr>
@@ -884,7 +1082,7 @@
       <w:outlineLvl w:val="0"/>
     </w:pPr>
     <w:rPr>
-      <w:rFonts w:asciiTheme="majorHAnsi" w:eastAsiaTheme="majorEastAsia" w:hAnsiTheme="majorHAnsi" w:cstheme="majorBidi" w:ascii="Microsoft YaHei" w:hAnsi="Microsoft YaHei" w:eastAsia="Microsoft YaHei"/>
+      <w:rFonts w:asciiTheme="majorHAnsi" w:eastAsiaTheme="majorEastAsia" w:hAnsiTheme="majorHAnsi" w:cstheme="majorBidi"/>
       <w:b/>
       <w:bCs/>
       <w:color w:val="365F91" w:themeColor="accent1" w:themeShade="BF"/>
@@ -908,7 +1106,7 @@
       <w:outlineLvl w:val="1"/>
     </w:pPr>
     <w:rPr>
-      <w:rFonts w:asciiTheme="majorHAnsi" w:eastAsiaTheme="majorEastAsia" w:hAnsiTheme="majorHAnsi" w:cstheme="majorBidi" w:ascii="Microsoft YaHei" w:hAnsi="Microsoft YaHei" w:eastAsia="Microsoft YaHei"/>
+      <w:rFonts w:asciiTheme="majorHAnsi" w:eastAsiaTheme="majorEastAsia" w:hAnsiTheme="majorHAnsi" w:cstheme="majorBidi"/>
       <w:b/>
       <w:bCs/>
       <w:color w:val="4F81BD" w:themeColor="accent1"/>
@@ -1173,7 +1371,7 @@
       <w:contextualSpacing/>
     </w:pPr>
     <w:rPr>
-      <w:rFonts w:asciiTheme="majorHAnsi" w:eastAsiaTheme="majorEastAsia" w:hAnsiTheme="majorHAnsi" w:cstheme="majorBidi" w:ascii="Microsoft YaHei" w:hAnsi="Microsoft YaHei" w:eastAsia="Microsoft YaHei"/>
+      <w:rFonts w:asciiTheme="majorHAnsi" w:eastAsiaTheme="majorEastAsia" w:hAnsiTheme="majorHAnsi" w:cstheme="majorBidi"/>
       <w:color w:val="17365D" w:themeColor="text2" w:themeShade="BF"/>
       <w:spacing w:val="5"/>
       <w:kern w:val="28"/>

</xml_diff>